<commit_message>
docs: update probability theory references
</commit_message>
<xml_diff>
--- a/probability_theory/references.docx
+++ b/probability_theory/references.docx
@@ -138,10 +138,7 @@
         <w:t>Probability Theory and Examples</w:t>
       </w:r>
       <w:r>
-        <w:t xml:space="preserve">, (Fifth Edition) </w:t>
-      </w:r>
-      <w:r>
-        <w:t>Cambridge University Press, New York</w:t>
+        <w:t>, (Fifth Edition) Cambridge University Press, New York</w:t>
       </w:r>
     </w:p>
     <w:p>
@@ -312,6 +309,14 @@
       </w:r>
       <w:r>
         <w:t>, Cambridge University Press, Cambridge</w:t>
+      </w:r>
+    </w:p>
+    <w:p>
+      <w:pPr>
+        <w:spacing w:line="240" w:lineRule="auto"/>
+      </w:pPr>
+      <w:r>
+        <w:t>White, Halbert (1996) Estimation, Inference and Specification Analysis, Cambridge  University Pres, New York.</w:t>
       </w:r>
     </w:p>
     <w:sectPr>

</xml_diff>